<commit_message>
Changes to iteration 1
</commit_message>
<xml_diff>
--- a/Mini-ORM-Iteration-1-Database-Layer.docx
+++ b/Mini-ORM-Iteration-1-Database-Layer.docx
@@ -1074,7 +1074,7 @@
         <w:spacing w:after="150"/>
       </w:pPr>
       <w:r>
-        <w:t xml:space="preserve">Точно затова Database.execute() приема sql: str и params: tuple като отделни аргументи.</w:t>
+        <w:t xml:space="preserve">Точно затова SqliteDatabase.execute() приема sql: str и params: tuple като отделни аргументи.</w:t>
       </w:r>
     </w:p>
     <w:p>
@@ -1225,7 +1225,7 @@
         <w:spacing w:after="150"/>
       </w:pPr>
       <w:r>
-        <w:t xml:space="preserve">Изолиран слой за директна комуникация с SQLite, напълно независим от ORM логиката. Класът Database не знае нищо за модели, полета или заявки над Python обекти — работи единствено със суров SQL текст и параметри.</w:t>
+        <w:t xml:space="preserve">Изолиран слой за директна комуникация с SQLite, напълно независим от ORM логиката. Класът SqliteDatabase не знае нищо за модели, полета или заявки над Python обекти — работи единствено със суров SQL текст и параметри.</w:t>
       </w:r>
     </w:p>
     <w:p>
@@ -1234,7 +1234,7 @@
         <w:spacing w:after="150" w:before="300"/>
       </w:pPr>
       <w:r>
-        <w:t xml:space="preserve">2.2 Клас Database</w:t>
+        <w:t xml:space="preserve">2.2 Клас SqliteDatabase</w:t>
       </w:r>
     </w:p>
     <w:p>
@@ -2006,7 +2006,7 @@
                 <w:sz w:val="19"/>
                 <w:szCs w:val="19"/>
               </w:rPr>
-              <w:t xml:space="preserve">with Database() as db:</w:t>
+              <w:t xml:space="preserve">with SqliteDatabase() as db:</w:t>
             </w:r>
           </w:p>
           <w:p>
@@ -2314,7 +2314,7 @@
                 <w:sz w:val="19"/>
                 <w:szCs w:val="19"/>
               </w:rPr>
-              <w:t xml:space="preserve">class TestDatabase(TestCase):</w:t>
+              <w:t xml:space="preserve">class TestSqliteDatabase(TestCase):</w:t>
             </w:r>
           </w:p>
           <w:p>
@@ -2340,7 +2340,7 @@
                 <w:sz w:val="19"/>
                 <w:szCs w:val="19"/>
               </w:rPr>
-              <w:t xml:space="preserve">        self.db = Database(":memory:")</w:t>
+              <w:t xml:space="preserve">        self.db = SqliteDatabase(":memory:")</w:t>
             </w:r>
           </w:p>
           <w:p>
@@ -2756,7 +2756,7 @@
               <w:spacing w:after="60"/>
             </w:pPr>
             <w:r>
-              <w:t xml:space="preserve">☑  Може ръчно да се изпълнява суров SQL и да се получават резултати през Database</w:t>
+              <w:t xml:space="preserve">☑  Може ръчно да се изпълнява суров SQL и да се получават резултати през SqliteDatabase</w:t>
             </w:r>
           </w:p>
           <w:p>
@@ -2796,7 +2796,7 @@
               <w:spacing w:after="60"/>
             </w:pPr>
             <w:r>
-              <w:t xml:space="preserve">☑  (По избор) with Database() as db: работи коректно</w:t>
+              <w:t xml:space="preserve">☑  (По избор) with SqliteDatabase() as db: работи коректно</w:t>
             </w:r>
           </w:p>
           <w:p>
@@ -2805,6 +2805,927 @@
             </w:pPr>
             <w:r>
               <w:t xml:space="preserve">☑  Всички примерни тестове от Раздел 2.4 минават успешно</w:t>
+            </w:r>
+          </w:p>
+        </w:tc>
+      </w:tr>
+    </w:tbl>
+    <w:p>
+      <w:r>
+        <w:br w:type="page"/>
+      </w:r>
+    </w:p>
+    <w:p>
+      <w:pPr>
+        <w:pStyle w:val="Heading1"/>
+        <w:spacing w:after="200" w:before="400"/>
+      </w:pPr>
+      <w:r>
+        <w:t xml:space="preserve">3. SOLID принципи в Mini ORM</w:t>
+      </w:r>
+    </w:p>
+    <w:p>
+      <w:pPr>
+        <w:spacing w:after="150"/>
+      </w:pPr>
+      <w:r>
+        <w:t xml:space="preserve">SOLID е акроним на пет принципа за обектно-ориентиран дизайн, чиято цел е кодът да остане лесен за поддръжка, разширяване и тестване с нарастване на проекта. Разделът по-долу дава конкретна насока как всеки принцип се прилага в контекста на Mini ORM — не само в Итерация 1, а като общ ориентир за целия проект през следващите итерации.</w:t>
+      </w:r>
+    </w:p>
+    <w:p>
+      <w:pPr>
+        <w:pStyle w:val="Heading2"/>
+        <w:spacing w:after="150" w:before="300"/>
+      </w:pPr>
+      <w:r>
+        <w:t xml:space="preserve">3.1 S — Single Responsibility Principle</w:t>
+      </w:r>
+    </w:p>
+    <w:p>
+      <w:pPr>
+        <w:spacing w:after="150"/>
+      </w:pPr>
+      <w:r>
+        <w:rPr>
+          <w:i/>
+          <w:iCs/>
+        </w:rPr>
+        <w:t xml:space="preserve">Всеки клас трябва да има точно една причина да се променя.</w:t>
+      </w:r>
+    </w:p>
+    <w:tbl>
+      <w:tblPr>
+        <w:tblW w:type="dxa" w:w="9350"/>
+        <w:tblBorders>
+          <w:top w:val="single" w:color="auto" w:sz="4"/>
+          <w:left w:val="single" w:color="auto" w:sz="4"/>
+          <w:bottom w:val="single" w:color="auto" w:sz="4"/>
+          <w:right w:val="single" w:color="auto" w:sz="4"/>
+          <w:insideH w:val="single" w:color="auto" w:sz="4"/>
+          <w:insideV w:val="single" w:color="auto" w:sz="4"/>
+        </w:tblBorders>
+      </w:tblPr>
+      <w:tblGrid>
+        <w:gridCol w:w="2800"/>
+        <w:gridCol w:w="6550"/>
+      </w:tblGrid>
+      <w:tr>
+        <w:trPr>
+          <w:tblHeader/>
+        </w:trPr>
+        <w:tc>
+          <w:tcPr>
+            <w:tcW w:type="dxa" w:w="2800"/>
+            <w:shd w:fill="1F4E5C" w:val="clear"/>
+            <w:tcMar>
+              <w:top w:type="dxa" w:w="80"/>
+              <w:left w:type="dxa" w:w="120"/>
+              <w:bottom w:type="dxa" w:w="80"/>
+              <w:right w:type="dxa" w:w="120"/>
+            </w:tcMar>
+          </w:tcPr>
+          <w:p>
+            <w:r>
+              <w:rPr>
+                <w:rFonts w:ascii="Consolas" w:cs="Consolas" w:eastAsia="Consolas" w:hAnsi="Consolas"/>
+                <w:b/>
+                <w:bCs/>
+                <w:color w:val="FFFFFF"/>
+                <w:sz w:val="20"/>
+                <w:szCs w:val="20"/>
+              </w:rPr>
+              <w:t xml:space="preserve">Клас</w:t>
+            </w:r>
+          </w:p>
+        </w:tc>
+        <w:tc>
+          <w:tcPr>
+            <w:tcW w:type="dxa" w:w="6550"/>
+            <w:shd w:fill="1F4E5C" w:val="clear"/>
+            <w:tcMar>
+              <w:top w:type="dxa" w:w="80"/>
+              <w:left w:type="dxa" w:w="120"/>
+              <w:bottom w:type="dxa" w:w="80"/>
+              <w:right w:type="dxa" w:w="120"/>
+            </w:tcMar>
+          </w:tcPr>
+          <w:p>
+            <w:r>
+              <w:rPr>
+                <w:b/>
+                <w:bCs/>
+                <w:color w:val="FFFFFF"/>
+                <w:sz w:val="20"/>
+                <w:szCs w:val="20"/>
+              </w:rPr>
+              <w:t xml:space="preserve">Единствена отговорност</w:t>
+            </w:r>
+          </w:p>
+        </w:tc>
+      </w:tr>
+      <w:tr>
+        <w:trPr>
+          <w:tblHeader w:val="false"/>
+        </w:trPr>
+        <w:tc>
+          <w:tcPr>
+            <w:tcW w:type="dxa" w:w="2800"/>
+            <w:tcMar>
+              <w:top w:type="dxa" w:w="80"/>
+              <w:left w:type="dxa" w:w="120"/>
+              <w:bottom w:type="dxa" w:w="80"/>
+              <w:right w:type="dxa" w:w="120"/>
+            </w:tcMar>
+          </w:tcPr>
+          <w:p>
+            <w:r>
+              <w:rPr>
+                <w:rFonts w:ascii="Consolas" w:cs="Consolas" w:eastAsia="Consolas" w:hAnsi="Consolas"/>
+                <w:b w:val="false"/>
+                <w:bCs w:val="false"/>
+                <w:color w:val="000000"/>
+                <w:sz w:val="20"/>
+                <w:szCs w:val="20"/>
+              </w:rPr>
+              <w:t xml:space="preserve">SqliteDatabase</w:t>
+            </w:r>
+          </w:p>
+        </w:tc>
+        <w:tc>
+          <w:tcPr>
+            <w:tcW w:type="dxa" w:w="6550"/>
+            <w:tcMar>
+              <w:top w:type="dxa" w:w="80"/>
+              <w:left w:type="dxa" w:w="120"/>
+              <w:bottom w:type="dxa" w:w="80"/>
+              <w:right w:type="dxa" w:w="120"/>
+            </w:tcMar>
+          </w:tcPr>
+          <w:p>
+            <w:r>
+              <w:rPr>
+                <w:b w:val="false"/>
+                <w:bCs w:val="false"/>
+                <w:color w:val="000000"/>
+                <w:sz w:val="20"/>
+                <w:szCs w:val="20"/>
+              </w:rPr>
+              <w:t xml:space="preserve">Комуникация със SQLite — нищо друго. Не знае за модели, полета или заявки</w:t>
+            </w:r>
+          </w:p>
+        </w:tc>
+      </w:tr>
+      <w:tr>
+        <w:trPr>
+          <w:tblHeader w:val="false"/>
+        </w:trPr>
+        <w:tc>
+          <w:tcPr>
+            <w:tcW w:type="dxa" w:w="2800"/>
+            <w:shd w:fill="EAF1F3" w:val="clear"/>
+            <w:tcMar>
+              <w:top w:type="dxa" w:w="80"/>
+              <w:left w:type="dxa" w:w="120"/>
+              <w:bottom w:type="dxa" w:w="80"/>
+              <w:right w:type="dxa" w:w="120"/>
+            </w:tcMar>
+          </w:tcPr>
+          <w:p>
+            <w:r>
+              <w:rPr>
+                <w:rFonts w:ascii="Consolas" w:cs="Consolas" w:eastAsia="Consolas" w:hAnsi="Consolas"/>
+                <w:b w:val="false"/>
+                <w:bCs w:val="false"/>
+                <w:color w:val="000000"/>
+                <w:sz w:val="20"/>
+                <w:szCs w:val="20"/>
+              </w:rPr>
+              <w:t xml:space="preserve">Field (и подкласовете)</w:t>
+            </w:r>
+          </w:p>
+        </w:tc>
+        <w:tc>
+          <w:tcPr>
+            <w:tcW w:type="dxa" w:w="6550"/>
+            <w:shd w:fill="EAF1F3" w:val="clear"/>
+            <w:tcMar>
+              <w:top w:type="dxa" w:w="80"/>
+              <w:left w:type="dxa" w:w="120"/>
+              <w:bottom w:type="dxa" w:w="80"/>
+              <w:right w:type="dxa" w:w="120"/>
+            </w:tcMar>
+          </w:tcPr>
+          <w:p>
+            <w:r>
+              <w:rPr>
+                <w:b w:val="false"/>
+                <w:bCs w:val="false"/>
+                <w:color w:val="000000"/>
+                <w:sz w:val="20"/>
+                <w:szCs w:val="20"/>
+              </w:rPr>
+              <w:t xml:space="preserve">Валидация и типова информация за една колона</w:t>
+            </w:r>
+          </w:p>
+        </w:tc>
+      </w:tr>
+      <w:tr>
+        <w:trPr>
+          <w:tblHeader w:val="false"/>
+        </w:trPr>
+        <w:tc>
+          <w:tcPr>
+            <w:tcW w:type="dxa" w:w="2800"/>
+            <w:tcMar>
+              <w:top w:type="dxa" w:w="80"/>
+              <w:left w:type="dxa" w:w="120"/>
+              <w:bottom w:type="dxa" w:w="80"/>
+              <w:right w:type="dxa" w:w="120"/>
+            </w:tcMar>
+          </w:tcPr>
+          <w:p>
+            <w:r>
+              <w:rPr>
+                <w:rFonts w:ascii="Consolas" w:cs="Consolas" w:eastAsia="Consolas" w:hAnsi="Consolas"/>
+                <w:b w:val="false"/>
+                <w:bCs w:val="false"/>
+                <w:color w:val="000000"/>
+                <w:sz w:val="20"/>
+                <w:szCs w:val="20"/>
+              </w:rPr>
+              <w:t xml:space="preserve">ModelMeta</w:t>
+            </w:r>
+          </w:p>
+        </w:tc>
+        <w:tc>
+          <w:tcPr>
+            <w:tcW w:type="dxa" w:w="6550"/>
+            <w:tcMar>
+              <w:top w:type="dxa" w:w="80"/>
+              <w:left w:type="dxa" w:w="120"/>
+              <w:bottom w:type="dxa" w:w="80"/>
+              <w:right w:type="dxa" w:w="120"/>
+            </w:tcMar>
+          </w:tcPr>
+          <w:p>
+            <w:r>
+              <w:rPr>
+                <w:b w:val="false"/>
+                <w:bCs w:val="false"/>
+                <w:color w:val="000000"/>
+                <w:sz w:val="20"/>
+                <w:szCs w:val="20"/>
+              </w:rPr>
+              <w:t xml:space="preserve">Само събиране на полетата и определяне на table_name при дефиниране на класа</w:t>
+            </w:r>
+          </w:p>
+        </w:tc>
+      </w:tr>
+      <w:tr>
+        <w:trPr>
+          <w:tblHeader w:val="false"/>
+        </w:trPr>
+        <w:tc>
+          <w:tcPr>
+            <w:tcW w:type="dxa" w:w="2800"/>
+            <w:shd w:fill="EAF1F3" w:val="clear"/>
+            <w:tcMar>
+              <w:top w:type="dxa" w:w="80"/>
+              <w:left w:type="dxa" w:w="120"/>
+              <w:bottom w:type="dxa" w:w="80"/>
+              <w:right w:type="dxa" w:w="120"/>
+            </w:tcMar>
+          </w:tcPr>
+          <w:p>
+            <w:r>
+              <w:rPr>
+                <w:rFonts w:ascii="Consolas" w:cs="Consolas" w:eastAsia="Consolas" w:hAnsi="Consolas"/>
+                <w:b w:val="false"/>
+                <w:bCs w:val="false"/>
+                <w:color w:val="000000"/>
+                <w:sz w:val="20"/>
+                <w:szCs w:val="20"/>
+              </w:rPr>
+              <w:t xml:space="preserve">Model</w:t>
+            </w:r>
+          </w:p>
+        </w:tc>
+        <w:tc>
+          <w:tcPr>
+            <w:tcW w:type="dxa" w:w="6550"/>
+            <w:shd w:fill="EAF1F3" w:val="clear"/>
+            <w:tcMar>
+              <w:top w:type="dxa" w:w="80"/>
+              <w:left w:type="dxa" w:w="120"/>
+              <w:bottom w:type="dxa" w:w="80"/>
+              <w:right w:type="dxa" w:w="120"/>
+            </w:tcMar>
+          </w:tcPr>
+          <w:p>
+            <w:r>
+              <w:rPr>
+                <w:b w:val="false"/>
+                <w:bCs w:val="false"/>
+                <w:color w:val="000000"/>
+                <w:sz w:val="20"/>
+                <w:szCs w:val="20"/>
+              </w:rPr>
+              <w:t xml:space="preserve">CRUD на ниво инстанция (save/delete) — не строи SQL заявки за филтриране</w:t>
+            </w:r>
+          </w:p>
+        </w:tc>
+      </w:tr>
+      <w:tr>
+        <w:trPr>
+          <w:tblHeader w:val="false"/>
+        </w:trPr>
+        <w:tc>
+          <w:tcPr>
+            <w:tcW w:type="dxa" w:w="2800"/>
+            <w:tcMar>
+              <w:top w:type="dxa" w:w="80"/>
+              <w:left w:type="dxa" w:w="120"/>
+              <w:bottom w:type="dxa" w:w="80"/>
+              <w:right w:type="dxa" w:w="120"/>
+            </w:tcMar>
+          </w:tcPr>
+          <w:p>
+            <w:r>
+              <w:rPr>
+                <w:rFonts w:ascii="Consolas" w:cs="Consolas" w:eastAsia="Consolas" w:hAnsi="Consolas"/>
+                <w:b w:val="false"/>
+                <w:bCs w:val="false"/>
+                <w:color w:val="000000"/>
+                <w:sz w:val="20"/>
+                <w:szCs w:val="20"/>
+              </w:rPr>
+              <w:t xml:space="preserve">QuerySet / Manager</w:t>
+            </w:r>
+          </w:p>
+        </w:tc>
+        <w:tc>
+          <w:tcPr>
+            <w:tcW w:type="dxa" w:w="6550"/>
+            <w:tcMar>
+              <w:top w:type="dxa" w:w="80"/>
+              <w:left w:type="dxa" w:w="120"/>
+              <w:bottom w:type="dxa" w:w="80"/>
+              <w:right w:type="dxa" w:w="120"/>
+            </w:tcMar>
+          </w:tcPr>
+          <w:p>
+            <w:r>
+              <w:rPr>
+                <w:b w:val="false"/>
+                <w:bCs w:val="false"/>
+                <w:color w:val="000000"/>
+                <w:sz w:val="20"/>
+                <w:szCs w:val="20"/>
+              </w:rPr>
+              <w:t xml:space="preserve">Построяване и изпълнение на SELECT заявки — не знае как се записва ред</w:t>
+            </w:r>
+          </w:p>
+        </w:tc>
+      </w:tr>
+    </w:tbl>
+    <w:p>
+      <w:pPr>
+        <w:spacing w:after="150"/>
+      </w:pPr>
+      <w:r>
+        <w:t xml:space="preserve">Ако забележиш, че даден клас започва да прави „две несвързани неща“ (напр. SqliteDatabase внезапно парсва lookup оператори като age__gte), това е сигнал, че отговорността трябва да се извади в отделен клас.</w:t>
+      </w:r>
+    </w:p>
+    <w:p>
+      <w:pPr>
+        <w:pStyle w:val="Heading2"/>
+        <w:spacing w:after="150" w:before="300"/>
+      </w:pPr>
+      <w:r>
+        <w:t xml:space="preserve">3.2 O — Open/Closed Principle</w:t>
+      </w:r>
+    </w:p>
+    <w:p>
+      <w:pPr>
+        <w:spacing w:after="150"/>
+      </w:pPr>
+      <w:r>
+        <w:rPr>
+          <w:i/>
+          <w:iCs/>
+        </w:rPr>
+        <w:t xml:space="preserve">Класовете трябва да са отворени за разширение, но затворени за модификация.</w:t>
+      </w:r>
+    </w:p>
+    <w:p>
+      <w:pPr>
+        <w:spacing w:after="150"/>
+      </w:pPr>
+      <w:r>
+        <w:t xml:space="preserve">Най-ясният пример в проекта: добавянето на нов тип поле (напр. DateField в бъдеще) не би трябвало да изисква промяна в Model, ModelMeta или QuerySet — само нов клас, наследяващ Field:</w:t>
+      </w:r>
+    </w:p>
+    <w:tbl>
+      <w:tblPr>
+        <w:tblW w:type="dxa" w:w="9350"/>
+        <w:tblBorders>
+          <w:top w:val="single" w:color="auto" w:sz="4"/>
+          <w:left w:val="single" w:color="auto" w:sz="4"/>
+          <w:bottom w:val="single" w:color="auto" w:sz="4"/>
+          <w:right w:val="single" w:color="auto" w:sz="4"/>
+          <w:insideH w:val="single" w:color="auto" w:sz="4"/>
+          <w:insideV w:val="single" w:color="auto" w:sz="4"/>
+        </w:tblBorders>
+      </w:tblPr>
+      <w:tblGrid>
+        <w:gridCol w:w="9350"/>
+      </w:tblGrid>
+      <w:tr>
+        <w:tc>
+          <w:tcPr>
+            <w:tcW w:type="dxa" w:w="9350"/>
+            <w:shd w:fill="F5F5F5" w:val="clear"/>
+            <w:tcMar>
+              <w:top w:type="dxa" w:w="120"/>
+              <w:left w:type="dxa" w:w="150"/>
+              <w:bottom w:type="dxa" w:w="120"/>
+              <w:right w:type="dxa" w:w="150"/>
+            </w:tcMar>
+          </w:tcPr>
+          <w:p>
+            <w:pPr>
+              <w:spacing w:after="0"/>
+            </w:pPr>
+            <w:r>
+              <w:rPr>
+                <w:rFonts w:ascii="Consolas" w:cs="Consolas" w:eastAsia="Consolas" w:hAnsi="Consolas"/>
+                <w:sz w:val="19"/>
+                <w:szCs w:val="19"/>
+              </w:rPr>
+              <w:t xml:space="preserve">class DateField(Field):</w:t>
+            </w:r>
+          </w:p>
+          <w:p>
+            <w:pPr>
+              <w:spacing w:after="0"/>
+            </w:pPr>
+            <w:r>
+              <w:rPr>
+                <w:rFonts w:ascii="Consolas" w:cs="Consolas" w:eastAsia="Consolas" w:hAnsi="Consolas"/>
+                <w:sz w:val="19"/>
+                <w:szCs w:val="19"/>
+              </w:rPr>
+              <w:t xml:space="preserve">    def validate(self, value):</w:t>
+            </w:r>
+          </w:p>
+          <w:p>
+            <w:pPr>
+              <w:spacing w:after="0"/>
+            </w:pPr>
+            <w:r>
+              <w:rPr>
+                <w:rFonts w:ascii="Consolas" w:cs="Consolas" w:eastAsia="Consolas" w:hAnsi="Consolas"/>
+                <w:sz w:val="19"/>
+                <w:szCs w:val="19"/>
+              </w:rPr>
+              <w:t xml:space="preserve">        if not isinstance(value, date):</w:t>
+            </w:r>
+          </w:p>
+          <w:p>
+            <w:pPr>
+              <w:spacing w:after="0"/>
+            </w:pPr>
+            <w:r>
+              <w:rPr>
+                <w:rFonts w:ascii="Consolas" w:cs="Consolas" w:eastAsia="Consolas" w:hAnsi="Consolas"/>
+                <w:sz w:val="19"/>
+                <w:szCs w:val="19"/>
+              </w:rPr>
+              <w:t xml:space="preserve">            raise ValueError("Expected a date value")</w:t>
+            </w:r>
+          </w:p>
+          <w:p>
+            <w:pPr>
+              <w:spacing w:after="0"/>
+            </w:pPr>
+            <w:r>
+              <w:rPr>
+                <w:rFonts w:ascii="Consolas" w:cs="Consolas" w:eastAsia="Consolas" w:hAnsi="Consolas"/>
+                <w:sz w:val="19"/>
+                <w:szCs w:val="19"/>
+              </w:rPr>
+              <w:t xml:space="preserve"> </w:t>
+            </w:r>
+          </w:p>
+          <w:p>
+            <w:pPr>
+              <w:spacing w:after="0"/>
+            </w:pPr>
+            <w:r>
+              <w:rPr>
+                <w:rFonts w:ascii="Consolas" w:cs="Consolas" w:eastAsia="Consolas" w:hAnsi="Consolas"/>
+                <w:sz w:val="19"/>
+                <w:szCs w:val="19"/>
+              </w:rPr>
+              <w:t xml:space="preserve">    def sql_type(self) -&gt; str:</w:t>
+            </w:r>
+          </w:p>
+          <w:p>
+            <w:pPr>
+              <w:spacing w:after="0"/>
+            </w:pPr>
+            <w:r>
+              <w:rPr>
+                <w:rFonts w:ascii="Consolas" w:cs="Consolas" w:eastAsia="Consolas" w:hAnsi="Consolas"/>
+                <w:sz w:val="19"/>
+                <w:szCs w:val="19"/>
+              </w:rPr>
+              <w:t xml:space="preserve">        return "DATE"</w:t>
+            </w:r>
+          </w:p>
+          <w:p>
+            <w:pPr>
+              <w:spacing w:after="0"/>
+            </w:pPr>
+            <w:r>
+              <w:rPr>
+                <w:rFonts w:ascii="Consolas" w:cs="Consolas" w:eastAsia="Consolas" w:hAnsi="Consolas"/>
+                <w:sz w:val="19"/>
+                <w:szCs w:val="19"/>
+              </w:rPr>
+              <w:t xml:space="preserve"> </w:t>
+            </w:r>
+          </w:p>
+          <w:p>
+            <w:pPr>
+              <w:spacing w:after="0"/>
+            </w:pPr>
+            <w:r>
+              <w:rPr>
+                <w:rFonts w:ascii="Consolas" w:cs="Consolas" w:eastAsia="Consolas" w:hAnsi="Consolas"/>
+                <w:sz w:val="19"/>
+                <w:szCs w:val="19"/>
+              </w:rPr>
+              <w:t xml:space="preserve"># Model/ModelMeta не се пипат — те вече работят с всеки Field подклас</w:t>
+            </w:r>
+          </w:p>
+        </w:tc>
+      </w:tr>
+    </w:tbl>
+    <w:p>
+      <w:pPr>
+        <w:spacing w:after="150"/>
+      </w:pPr>
+      <w:r>
+        <w:t xml:space="preserve">Същият принцип важи за lookup операторите (Раздел 6.5 от общата спецификация) — добавянето на нов оператор (напр. __startswith) трябва да е добавяне на нов запис в мапинг речник, не промяна на съществуваща if/elif верига, ако е възможно да се проектира така.</w:t>
+      </w:r>
+    </w:p>
+    <w:p>
+      <w:pPr>
+        <w:pStyle w:val="Heading2"/>
+        <w:spacing w:after="150" w:before="300"/>
+      </w:pPr>
+      <w:r>
+        <w:t xml:space="preserve">3.3 L — Liskov Substitution Principle</w:t>
+      </w:r>
+    </w:p>
+    <w:p>
+      <w:pPr>
+        <w:spacing w:after="150"/>
+      </w:pPr>
+      <w:r>
+        <w:rPr>
+          <w:i/>
+          <w:iCs/>
+        </w:rPr>
+        <w:t xml:space="preserve">Обект от подклас трябва да може да замества обект от базовия клас, без да чупи очакваното поведение.</w:t>
+      </w:r>
+    </w:p>
+    <w:p>
+      <w:pPr>
+        <w:spacing w:after="150"/>
+      </w:pPr>
+      <w:r>
+        <w:t xml:space="preserve">Ключово за месец 2, когато се появи BaseDatabase с SqliteDatabase и PostgresDatabase като подкласове: навсякъде, където кодът очаква BaseDatabase (напр. Model._database), трябва да работи еднакво добре с която и да е от двете конкретни имплементации — еднакви сигнатури, еднакви типове връщани стойности, еднакво поведение при грешка.</w:t>
+      </w:r>
+    </w:p>
+    <w:tbl>
+      <w:tblPr>
+        <w:tblW w:type="dxa" w:w="9350"/>
+        <w:tblBorders>
+          <w:top w:val="single" w:color="auto" w:sz="4"/>
+          <w:left w:val="single" w:color="auto" w:sz="4"/>
+          <w:bottom w:val="single" w:color="auto" w:sz="4"/>
+          <w:right w:val="single" w:color="auto" w:sz="4"/>
+          <w:insideH w:val="single" w:color="auto" w:sz="4"/>
+          <w:insideV w:val="single" w:color="auto" w:sz="4"/>
+        </w:tblBorders>
+      </w:tblPr>
+      <w:tblGrid>
+        <w:gridCol w:w="9350"/>
+      </w:tblGrid>
+      <w:tr>
+        <w:tc>
+          <w:tcPr>
+            <w:tcW w:type="dxa" w:w="9350"/>
+            <w:shd w:fill="FFF3E0" w:val="clear"/>
+            <w:tcMar>
+              <w:top w:type="dxa" w:w="120"/>
+              <w:left w:type="dxa" w:w="180"/>
+              <w:bottom w:type="dxa" w:w="120"/>
+              <w:right w:type="dxa" w:w="180"/>
+            </w:tcMar>
+          </w:tcPr>
+          <w:p>
+            <w:r>
+              <w:rPr>
+                <w:b/>
+                <w:bCs/>
+                <w:color w:val="AA5500"/>
+              </w:rPr>
+              <w:t xml:space="preserve">⚠  Важно: </w:t>
+            </w:r>
+            <w:r>
+              <w:t xml:space="preserve">Внимавай особено с fetch_one()/fetch_all() — ако утре PostgresDatabase върне списък от dict-ове вместо tuples, това чупи LSP, защото горните слоеве (Model) очакват точно tuple формата, установен в Итерация 1.</w:t>
+            </w:r>
+          </w:p>
+        </w:tc>
+      </w:tr>
+    </w:tbl>
+    <w:p>
+      <w:pPr>
+        <w:pStyle w:val="Heading2"/>
+        <w:spacing w:after="150" w:before="300"/>
+      </w:pPr>
+      <w:r>
+        <w:t xml:space="preserve">3.4 I — Interface Segregation Principle</w:t>
+      </w:r>
+    </w:p>
+    <w:p>
+      <w:pPr>
+        <w:spacing w:after="150"/>
+      </w:pPr>
+      <w:r>
+        <w:rPr>
+          <w:i/>
+          <w:iCs/>
+        </w:rPr>
+        <w:t xml:space="preserve">Никой клас не трябва да е принуден да зависи от методи, които не използва.</w:t>
+      </w:r>
+    </w:p>
+    <w:p>
+      <w:pPr>
+        <w:spacing w:after="150"/>
+      </w:pPr>
+      <w:r>
+        <w:t xml:space="preserve">Приложимо, когато дефинираш BaseDatabase (месец 2) — дръж интерфейса минимален (execute, fetch_all, fetch_one, close). Не добавяй методи като create_index() или backup(), освен ако наистина всяка конкретна база ще ги имплементира — иначе принуждаваш бъдещи подкласове да имплементират методи, които не им трябват или не могат да поддържат смислено.</w:t>
+      </w:r>
+    </w:p>
+    <w:p>
+      <w:pPr>
+        <w:pStyle w:val="Heading2"/>
+        <w:spacing w:after="150" w:before="300"/>
+      </w:pPr>
+      <w:r>
+        <w:t xml:space="preserve">3.5 D — Dependency Inversion Principle</w:t>
+      </w:r>
+    </w:p>
+    <w:p>
+      <w:pPr>
+        <w:spacing w:after="150"/>
+      </w:pPr>
+      <w:r>
+        <w:rPr>
+          <w:i/>
+          <w:iCs/>
+        </w:rPr>
+        <w:t xml:space="preserve">Модулите от високо ниво не трябва да зависят от модули от ниско ниво — и двата трябва да зависят от абстракции.</w:t>
+      </w:r>
+    </w:p>
+    <w:p>
+      <w:pPr>
+        <w:spacing w:after="150"/>
+      </w:pPr>
+      <w:r>
+        <w:t xml:space="preserve">Това е принципът, който обсъдихме конкретно за SqliteDatabase — Model не трябва да прави import sqlite3 или да знае каквато и да е SQLite-специфична подробност. Model комуникира само през публичния интерфейс на SqliteDatabase (execute/fetch_all/fetch_one/close):</w:t>
+      </w:r>
+    </w:p>
+    <w:tbl>
+      <w:tblPr>
+        <w:tblW w:type="dxa" w:w="9350"/>
+        <w:tblBorders>
+          <w:top w:val="single" w:color="auto" w:sz="4"/>
+          <w:left w:val="single" w:color="auto" w:sz="4"/>
+          <w:bottom w:val="single" w:color="auto" w:sz="4"/>
+          <w:right w:val="single" w:color="auto" w:sz="4"/>
+          <w:insideH w:val="single" w:color="auto" w:sz="4"/>
+          <w:insideV w:val="single" w:color="auto" w:sz="4"/>
+        </w:tblBorders>
+      </w:tblPr>
+      <w:tblGrid>
+        <w:gridCol w:w="9350"/>
+      </w:tblGrid>
+      <w:tr>
+        <w:tc>
+          <w:tcPr>
+            <w:tcW w:type="dxa" w:w="9350"/>
+            <w:shd w:fill="F5F5F5" w:val="clear"/>
+            <w:tcMar>
+              <w:top w:type="dxa" w:w="120"/>
+              <w:left w:type="dxa" w:w="150"/>
+              <w:bottom w:type="dxa" w:w="120"/>
+              <w:right w:type="dxa" w:w="150"/>
+            </w:tcMar>
+          </w:tcPr>
+          <w:p>
+            <w:pPr>
+              <w:spacing w:after="0"/>
+            </w:pPr>
+            <w:r>
+              <w:rPr>
+                <w:rFonts w:ascii="Consolas" w:cs="Consolas" w:eastAsia="Consolas" w:hAnsi="Consolas"/>
+                <w:sz w:val="19"/>
+                <w:szCs w:val="19"/>
+              </w:rPr>
+              <w:t xml:space="preserve">class Model:</w:t>
+            </w:r>
+          </w:p>
+          <w:p>
+            <w:pPr>
+              <w:spacing w:after="0"/>
+            </w:pPr>
+            <w:r>
+              <w:rPr>
+                <w:rFonts w:ascii="Consolas" w:cs="Consolas" w:eastAsia="Consolas" w:hAnsi="Consolas"/>
+                <w:sz w:val="19"/>
+                <w:szCs w:val="19"/>
+              </w:rPr>
+              <w:t xml:space="preserve">    _database: SqliteDatabase   # инжектирано отвън, не хардкоднато вътре</w:t>
+            </w:r>
+          </w:p>
+          <w:p>
+            <w:pPr>
+              <w:spacing w:after="0"/>
+            </w:pPr>
+            <w:r>
+              <w:rPr>
+                <w:rFonts w:ascii="Consolas" w:cs="Consolas" w:eastAsia="Consolas" w:hAnsi="Consolas"/>
+                <w:sz w:val="19"/>
+                <w:szCs w:val="19"/>
+              </w:rPr>
+              <w:t xml:space="preserve"> </w:t>
+            </w:r>
+          </w:p>
+          <w:p>
+            <w:pPr>
+              <w:spacing w:after="0"/>
+            </w:pPr>
+            <w:r>
+              <w:rPr>
+                <w:rFonts w:ascii="Consolas" w:cs="Consolas" w:eastAsia="Consolas" w:hAnsi="Consolas"/>
+                <w:sz w:val="19"/>
+                <w:szCs w:val="19"/>
+              </w:rPr>
+              <w:t xml:space="preserve">    @classmethod</w:t>
+            </w:r>
+          </w:p>
+          <w:p>
+            <w:pPr>
+              <w:spacing w:after="0"/>
+            </w:pPr>
+            <w:r>
+              <w:rPr>
+                <w:rFonts w:ascii="Consolas" w:cs="Consolas" w:eastAsia="Consolas" w:hAnsi="Consolas"/>
+                <w:sz w:val="19"/>
+                <w:szCs w:val="19"/>
+              </w:rPr>
+              <w:t xml:space="preserve">    def create_table(cls):</w:t>
+            </w:r>
+          </w:p>
+          <w:p>
+            <w:pPr>
+              <w:spacing w:after="0"/>
+            </w:pPr>
+            <w:r>
+              <w:rPr>
+                <w:rFonts w:ascii="Consolas" w:cs="Consolas" w:eastAsia="Consolas" w:hAnsi="Consolas"/>
+                <w:sz w:val="19"/>
+                <w:szCs w:val="19"/>
+              </w:rPr>
+              <w:t xml:space="preserve">        sql = cls._generate_create_table_sql()</w:t>
+            </w:r>
+          </w:p>
+          <w:p>
+            <w:pPr>
+              <w:spacing w:after="0"/>
+            </w:pPr>
+            <w:r>
+              <w:rPr>
+                <w:rFonts w:ascii="Consolas" w:cs="Consolas" w:eastAsia="Consolas" w:hAnsi="Consolas"/>
+                <w:sz w:val="19"/>
+                <w:szCs w:val="19"/>
+              </w:rPr>
+              <w:t xml:space="preserve">        cls._database.execute(sql)   # Model знае само публичния интерфейс</w:t>
+            </w:r>
+          </w:p>
+        </w:tc>
+      </w:tr>
+    </w:tbl>
+    <w:p>
+      <w:pPr>
+        <w:spacing w:after="150"/>
+      </w:pPr>
+      <w:r>
+        <w:t xml:space="preserve">Практическата полза: когато в месец 2 добавиш PostgresDatabase, единствената промяна е коя конкретна инстанция се подава на Model._database — нулева промяна в Model, ModelMeta или QuerySet логиката.</w:t>
+      </w:r>
+    </w:p>
+    <w:p>
+      <w:pPr>
+        <w:pStyle w:val="Heading2"/>
+        <w:spacing w:after="150" w:before="300"/>
+      </w:pPr>
+      <w:r>
+        <w:t xml:space="preserve">3.6 Практическа препоръка за целия проект</w:t>
+      </w:r>
+    </w:p>
+    <w:tbl>
+      <w:tblPr>
+        <w:tblW w:type="dxa" w:w="9350"/>
+        <w:tblBorders>
+          <w:top w:val="single" w:color="auto" w:sz="4"/>
+          <w:left w:val="single" w:color="auto" w:sz="4"/>
+          <w:bottom w:val="single" w:color="auto" w:sz="4"/>
+          <w:right w:val="single" w:color="auto" w:sz="4"/>
+          <w:insideH w:val="single" w:color="auto" w:sz="4"/>
+          <w:insideV w:val="single" w:color="auto" w:sz="4"/>
+        </w:tblBorders>
+      </w:tblPr>
+      <w:tblGrid>
+        <w:gridCol w:w="9350"/>
+      </w:tblGrid>
+      <w:tr>
+        <w:tc>
+          <w:tcPr>
+            <w:tcW w:type="dxa" w:w="9350"/>
+            <w:shd w:fill="EAF1F3" w:val="clear"/>
+            <w:tcMar>
+              <w:top w:type="dxa" w:w="150"/>
+              <w:left w:type="dxa" w:w="200"/>
+              <w:bottom w:type="dxa" w:w="150"/>
+              <w:right w:type="dxa" w:w="200"/>
+            </w:tcMar>
+          </w:tcPr>
+          <w:p>
+            <w:pPr>
+              <w:spacing w:after="100"/>
+            </w:pPr>
+            <w:r>
+              <w:rPr>
+                <w:b/>
+                <w:bCs/>
+                <w:color w:val="1F4E5C"/>
+              </w:rPr>
+              <w:t xml:space="preserve">Чеклист за SOLID преди всеки commit:</w:t>
+            </w:r>
+          </w:p>
+          <w:p>
+            <w:pPr>
+              <w:spacing w:after="60"/>
+            </w:pPr>
+            <w:r>
+              <w:t xml:space="preserve">☑  Всеки нов клас/метод отговаря на един ясен въпрос: "Каква е единствената му отговорност?"</w:t>
+            </w:r>
+          </w:p>
+          <w:p>
+            <w:pPr>
+              <w:spacing w:after="60"/>
+            </w:pPr>
+            <w:r>
+              <w:t xml:space="preserve">☑  Добавянето на нов Field тип или lookup оператор не изисква промяна на съществуващ, работещ код</w:t>
+            </w:r>
+          </w:p>
+          <w:p>
+            <w:pPr>
+              <w:spacing w:after="60"/>
+            </w:pPr>
+            <w:r>
+              <w:t xml:space="preserve">☑  Всеки метод на SqliteDatabase има сигнатура и поведение, което лесно ще се повтори от бъдещ PostgresDatabase</w:t>
+            </w:r>
+          </w:p>
+          <w:p>
+            <w:pPr>
+              <w:spacing w:after="60"/>
+            </w:pPr>
+            <w:r>
+              <w:t xml:space="preserve">☑  Горните слоеве (Model, QuerySet) не съдържат import sqlite3 или SQL диалект-специфичен синтаксис</w:t>
+            </w:r>
+          </w:p>
+          <w:p>
+            <w:pPr>
+              <w:spacing w:after="60"/>
+            </w:pPr>
+            <w:r>
+              <w:t xml:space="preserve">☑  Публичните интерфейси (SqliteDatabase, Field) остават малки и фокусирани — не се добавят методи "за всеки случай"</w:t>
             </w:r>
           </w:p>
         </w:tc>

</xml_diff>